<commit_message>
Término do Banner do TCC
</commit_message>
<xml_diff>
--- a/Documentação/Banner/Banner TCC.docx
+++ b/Documentação/Banner/Banner TCC.docx
@@ -181,7 +181,13 @@
         <w:rPr>
           <w:spacing w:val="-2"/>
         </w:rPr>
-        <w:t>Sistema Web de Gerenciamento de EPI</w:t>
+        <w:t>Sistema Web de Gerenciamento de E</w:t>
+      </w:r>
+      <w:r>
+        <w:rPr>
+          <w:spacing w:val="-2"/>
+        </w:rPr>
+        <w:t>quipamentos de Proteção Individual (EPI)</w:t>
       </w:r>
     </w:p>
     <w:p>
@@ -447,7 +453,7 @@
         <mc:AlternateContent>
           <mc:Choice Requires="wps">
             <w:drawing>
-              <wp:inline distT="0" distB="0" distL="0" distR="0" wp14:anchorId="6BE8ED86" wp14:editId="3A59C981">
+              <wp:inline distT="0" distB="0" distL="0" distR="0" wp14:anchorId="6BE8ED86" wp14:editId="2B74FCAA">
                 <wp:extent cx="6604634" cy="3440429"/>
                 <wp:effectExtent l="0" t="0" r="25400" b="27305"/>
                 <wp:docPr id="5" name="Textbox 5"/>
@@ -482,47 +488,8 @@
                         <w:txbxContent>
                           <w:p>
                             <w:pPr>
-                              <w:pStyle w:val="Corpodetexto"/>
-                              <w:rPr>
-                                <w:color w:val="000000"/>
-                                <w:sz w:val="44"/>
-                              </w:rPr>
-                            </w:pPr>
-                          </w:p>
-                          <w:p>
-                            <w:pPr>
-                              <w:pStyle w:val="Corpodetexto"/>
-                              <w:rPr>
-                                <w:color w:val="000000"/>
-                                <w:sz w:val="44"/>
-                              </w:rPr>
-                            </w:pPr>
-                          </w:p>
-                          <w:p>
-                            <w:pPr>
-                              <w:pStyle w:val="Corpodetexto"/>
-                              <w:rPr>
-                                <w:color w:val="000000"/>
-                                <w:sz w:val="44"/>
-                              </w:rPr>
-                            </w:pPr>
-                          </w:p>
-                          <w:p>
-                            <w:pPr>
-                              <w:pStyle w:val="Corpodetexto"/>
-                              <w:spacing w:before="423"/>
-                              <w:jc w:val="center"/>
-                              <w:rPr>
-                                <w:color w:val="000000"/>
-                                <w:sz w:val="44"/>
-                              </w:rPr>
-                            </w:pPr>
-                          </w:p>
-                          <w:p>
-                            <w:pPr>
                               <w:spacing w:before="1"/>
                               <w:ind w:right="1"/>
-                              <w:jc w:val="center"/>
                               <w:rPr>
                                 <w:i/>
                                 <w:color w:val="000000"/>
@@ -532,45 +499,51 @@
                             <w:r>
                               <w:rPr>
                                 <w:i/>
+                                <w:noProof/>
                                 <w:color w:val="000000"/>
                                 <w:sz w:val="44"/>
                               </w:rPr>
-                              <w:t>Figura</w:t>
-                            </w:r>
-                            <w:r>
-                              <w:rPr>
-                                <w:i/>
-                                <w:color w:val="000000"/>
-                                <w:spacing w:val="6"/>
-                                <w:sz w:val="44"/>
-                              </w:rPr>
-                              <w:t xml:space="preserve"> </w:t>
-                            </w:r>
-                            <w:r>
-                              <w:rPr>
-                                <w:i/>
-                                <w:color w:val="000000"/>
-                                <w:sz w:val="44"/>
-                              </w:rPr>
-                              <w:t>(se</w:t>
-                            </w:r>
-                            <w:r>
-                              <w:rPr>
-                                <w:i/>
-                                <w:color w:val="000000"/>
-                                <w:spacing w:val="7"/>
-                                <w:sz w:val="44"/>
-                              </w:rPr>
-                              <w:t xml:space="preserve"> </w:t>
-                            </w:r>
-                            <w:r>
-                              <w:rPr>
-                                <w:i/>
-                                <w:color w:val="000000"/>
-                                <w:spacing w:val="-2"/>
-                                <w:sz w:val="44"/>
-                              </w:rPr>
-                              <w:t>tiver)</w:t>
+                              <w:drawing>
+                                <wp:inline distT="0" distB="0" distL="0" distR="0" wp14:anchorId="4166AEAC" wp14:editId="044F899C">
+                                  <wp:extent cx="6615095" cy="3439795"/>
+                                  <wp:effectExtent l="0" t="0" r="0" b="8255"/>
+                                  <wp:docPr id="361371672" name="Imagem 7"/>
+                                  <wp:cNvGraphicFramePr>
+                                    <a:graphicFrameLocks xmlns:a="http://schemas.openxmlformats.org/drawingml/2006/main" noChangeAspect="1"/>
+                                  </wp:cNvGraphicFramePr>
+                                  <a:graphic xmlns:a="http://schemas.openxmlformats.org/drawingml/2006/main">
+                                    <a:graphicData uri="http://schemas.openxmlformats.org/drawingml/2006/picture">
+                                      <pic:pic xmlns:pic="http://schemas.openxmlformats.org/drawingml/2006/picture">
+                                        <pic:nvPicPr>
+                                          <pic:cNvPr id="361371672" name="Imagem 361371672"/>
+                                          <pic:cNvPicPr/>
+                                        </pic:nvPicPr>
+                                        <pic:blipFill>
+                                          <a:blip r:embed="rId10">
+                                            <a:extLst>
+                                              <a:ext uri="{28A0092B-C50C-407E-A947-70E740481C1C}">
+                                                <a14:useLocalDpi xmlns:a14="http://schemas.microsoft.com/office/drawing/2010/main" val="0"/>
+                                              </a:ext>
+                                            </a:extLst>
+                                          </a:blip>
+                                          <a:stretch>
+                                            <a:fillRect/>
+                                          </a:stretch>
+                                        </pic:blipFill>
+                                        <pic:spPr>
+                                          <a:xfrm>
+                                            <a:off x="0" y="0"/>
+                                            <a:ext cx="6615095" cy="3439795"/>
+                                          </a:xfrm>
+                                          <a:prstGeom prst="rect">
+                                            <a:avLst/>
+                                          </a:prstGeom>
+                                        </pic:spPr>
+                                      </pic:pic>
+                                    </a:graphicData>
+                                  </a:graphic>
+                                </wp:inline>
+                              </w:drawing>
                             </w:r>
                           </w:p>
                         </w:txbxContent>
@@ -596,47 +569,8 @@
                   <w:txbxContent>
                     <w:p>
                       <w:pPr>
-                        <w:pStyle w:val="Corpodetexto"/>
-                        <w:rPr>
-                          <w:color w:val="000000"/>
-                          <w:sz w:val="44"/>
-                        </w:rPr>
-                      </w:pPr>
-                    </w:p>
-                    <w:p>
-                      <w:pPr>
-                        <w:pStyle w:val="Corpodetexto"/>
-                        <w:rPr>
-                          <w:color w:val="000000"/>
-                          <w:sz w:val="44"/>
-                        </w:rPr>
-                      </w:pPr>
-                    </w:p>
-                    <w:p>
-                      <w:pPr>
-                        <w:pStyle w:val="Corpodetexto"/>
-                        <w:rPr>
-                          <w:color w:val="000000"/>
-                          <w:sz w:val="44"/>
-                        </w:rPr>
-                      </w:pPr>
-                    </w:p>
-                    <w:p>
-                      <w:pPr>
-                        <w:pStyle w:val="Corpodetexto"/>
-                        <w:spacing w:before="423"/>
-                        <w:jc w:val="center"/>
-                        <w:rPr>
-                          <w:color w:val="000000"/>
-                          <w:sz w:val="44"/>
-                        </w:rPr>
-                      </w:pPr>
-                    </w:p>
-                    <w:p>
-                      <w:pPr>
                         <w:spacing w:before="1"/>
                         <w:ind w:right="1"/>
-                        <w:jc w:val="center"/>
                         <w:rPr>
                           <w:i/>
                           <w:color w:val="000000"/>
@@ -646,45 +580,51 @@
                       <w:r>
                         <w:rPr>
                           <w:i/>
+                          <w:noProof/>
                           <w:color w:val="000000"/>
                           <w:sz w:val="44"/>
                         </w:rPr>
-                        <w:t>Figura</w:t>
-                      </w:r>
-                      <w:r>
-                        <w:rPr>
-                          <w:i/>
-                          <w:color w:val="000000"/>
-                          <w:spacing w:val="6"/>
-                          <w:sz w:val="44"/>
-                        </w:rPr>
-                        <w:t xml:space="preserve"> </w:t>
-                      </w:r>
-                      <w:r>
-                        <w:rPr>
-                          <w:i/>
-                          <w:color w:val="000000"/>
-                          <w:sz w:val="44"/>
-                        </w:rPr>
-                        <w:t>(se</w:t>
-                      </w:r>
-                      <w:r>
-                        <w:rPr>
-                          <w:i/>
-                          <w:color w:val="000000"/>
-                          <w:spacing w:val="7"/>
-                          <w:sz w:val="44"/>
-                        </w:rPr>
-                        <w:t xml:space="preserve"> </w:t>
-                      </w:r>
-                      <w:r>
-                        <w:rPr>
-                          <w:i/>
-                          <w:color w:val="000000"/>
-                          <w:spacing w:val="-2"/>
-                          <w:sz w:val="44"/>
-                        </w:rPr>
-                        <w:t>tiver)</w:t>
+                        <w:drawing>
+                          <wp:inline distT="0" distB="0" distL="0" distR="0" wp14:anchorId="4166AEAC" wp14:editId="044F899C">
+                            <wp:extent cx="6615095" cy="3439795"/>
+                            <wp:effectExtent l="0" t="0" r="0" b="8255"/>
+                            <wp:docPr id="361371672" name="Imagem 7"/>
+                            <wp:cNvGraphicFramePr>
+                              <a:graphicFrameLocks xmlns:a="http://schemas.openxmlformats.org/drawingml/2006/main" noChangeAspect="1"/>
+                            </wp:cNvGraphicFramePr>
+                            <a:graphic xmlns:a="http://schemas.openxmlformats.org/drawingml/2006/main">
+                              <a:graphicData uri="http://schemas.openxmlformats.org/drawingml/2006/picture">
+                                <pic:pic xmlns:pic="http://schemas.openxmlformats.org/drawingml/2006/picture">
+                                  <pic:nvPicPr>
+                                    <pic:cNvPr id="361371672" name="Imagem 361371672"/>
+                                    <pic:cNvPicPr/>
+                                  </pic:nvPicPr>
+                                  <pic:blipFill>
+                                    <a:blip r:embed="rId10">
+                                      <a:extLst>
+                                        <a:ext uri="{28A0092B-C50C-407E-A947-70E740481C1C}">
+                                          <a14:useLocalDpi xmlns:a14="http://schemas.microsoft.com/office/drawing/2010/main" val="0"/>
+                                        </a:ext>
+                                      </a:extLst>
+                                    </a:blip>
+                                    <a:stretch>
+                                      <a:fillRect/>
+                                    </a:stretch>
+                                  </pic:blipFill>
+                                  <pic:spPr>
+                                    <a:xfrm>
+                                      <a:off x="0" y="0"/>
+                                      <a:ext cx="6615095" cy="3439795"/>
+                                    </a:xfrm>
+                                    <a:prstGeom prst="rect">
+                                      <a:avLst/>
+                                    </a:prstGeom>
+                                  </pic:spPr>
+                                </pic:pic>
+                              </a:graphicData>
+                            </a:graphic>
+                          </wp:inline>
+                        </w:drawing>
                       </w:r>
                     </w:p>
                   </w:txbxContent>
@@ -1008,6 +948,46 @@
                                 <w:sz w:val="44"/>
                               </w:rPr>
                             </w:pPr>
+                            <w:r>
+                              <w:rPr>
+                                <w:noProof/>
+                              </w:rPr>
+                              <w:drawing>
+                                <wp:inline distT="0" distB="0" distL="0" distR="0" wp14:anchorId="64BD0F2E" wp14:editId="1CD8641F">
+                                  <wp:extent cx="6592570" cy="3439795"/>
+                                  <wp:effectExtent l="0" t="0" r="0" b="8255"/>
+                                  <wp:docPr id="1177586942" name="Imagem 1"/>
+                                  <wp:cNvGraphicFramePr>
+                                    <a:graphicFrameLocks xmlns:a="http://schemas.openxmlformats.org/drawingml/2006/main" noChangeAspect="1"/>
+                                  </wp:cNvGraphicFramePr>
+                                  <a:graphic xmlns:a="http://schemas.openxmlformats.org/drawingml/2006/main">
+                                    <a:graphicData uri="http://schemas.openxmlformats.org/drawingml/2006/picture">
+                                      <pic:pic xmlns:pic="http://schemas.openxmlformats.org/drawingml/2006/picture">
+                                        <pic:nvPicPr>
+                                          <pic:cNvPr id="1177586942" name=""/>
+                                          <pic:cNvPicPr/>
+                                        </pic:nvPicPr>
+                                        <pic:blipFill>
+                                          <a:blip r:embed="rId11"/>
+                                          <a:stretch>
+                                            <a:fillRect/>
+                                          </a:stretch>
+                                        </pic:blipFill>
+                                        <pic:spPr>
+                                          <a:xfrm>
+                                            <a:off x="0" y="0"/>
+                                            <a:ext cx="6592570" cy="3439795"/>
+                                          </a:xfrm>
+                                          <a:prstGeom prst="rect">
+                                            <a:avLst/>
+                                          </a:prstGeom>
+                                        </pic:spPr>
+                                      </pic:pic>
+                                    </a:graphicData>
+                                  </a:graphic>
+                                </wp:inline>
+                              </w:drawing>
+                            </w:r>
                           </w:p>
                           <w:p>
                             <w:pPr>
@@ -1117,6 +1097,46 @@
                           <w:sz w:val="44"/>
                         </w:rPr>
                       </w:pPr>
+                      <w:r>
+                        <w:rPr>
+                          <w:noProof/>
+                        </w:rPr>
+                        <w:drawing>
+                          <wp:inline distT="0" distB="0" distL="0" distR="0" wp14:anchorId="64BD0F2E" wp14:editId="1CD8641F">
+                            <wp:extent cx="6592570" cy="3439795"/>
+                            <wp:effectExtent l="0" t="0" r="0" b="8255"/>
+                            <wp:docPr id="1177586942" name="Imagem 1"/>
+                            <wp:cNvGraphicFramePr>
+                              <a:graphicFrameLocks xmlns:a="http://schemas.openxmlformats.org/drawingml/2006/main" noChangeAspect="1"/>
+                            </wp:cNvGraphicFramePr>
+                            <a:graphic xmlns:a="http://schemas.openxmlformats.org/drawingml/2006/main">
+                              <a:graphicData uri="http://schemas.openxmlformats.org/drawingml/2006/picture">
+                                <pic:pic xmlns:pic="http://schemas.openxmlformats.org/drawingml/2006/picture">
+                                  <pic:nvPicPr>
+                                    <pic:cNvPr id="1177586942" name=""/>
+                                    <pic:cNvPicPr/>
+                                  </pic:nvPicPr>
+                                  <pic:blipFill>
+                                    <a:blip r:embed="rId11"/>
+                                    <a:stretch>
+                                      <a:fillRect/>
+                                    </a:stretch>
+                                  </pic:blipFill>
+                                  <pic:spPr>
+                                    <a:xfrm>
+                                      <a:off x="0" y="0"/>
+                                      <a:ext cx="6592570" cy="3439795"/>
+                                    </a:xfrm>
+                                    <a:prstGeom prst="rect">
+                                      <a:avLst/>
+                                    </a:prstGeom>
+                                  </pic:spPr>
+                                </pic:pic>
+                              </a:graphicData>
+                            </a:graphic>
+                          </wp:inline>
+                        </w:drawing>
+                      </w:r>
                     </w:p>
                     <w:p>
                       <w:pPr>
@@ -1984,6 +2004,7 @@
   <w:style w:type="character" w:default="1" w:styleId="Fontepargpadro">
     <w:name w:val="Default Paragraph Font"/>
     <w:uiPriority w:val="1"/>
+    <w:semiHidden/>
     <w:unhideWhenUsed/>
   </w:style>
   <w:style w:type="table" w:default="1" w:styleId="Tabelanormal">

</xml_diff>